<commit_message>
Windmill 5145f78+ vendored: the teacher's edition prints the warm-up's retrieves lines and the Variation note (rules 5 and 2), the split label once, contents titles at one size; Unit 4 rebuilt and reinstalled at 0 findings
Co-Authored-By: Claude Fable 5.1 <noreply@anthropic.com>
Claude-Session: https://claude.ai/code/session_01B7ovt6yLjh6QuFV9HBMV4N
</commit_message>
<xml_diff>
--- a/a7/build/out/u4/A7 4.01 Adding and Subtracting in Scientific Notation - Teacher Edition.docx
+++ b/a7/build/out/u4/A7 4.01 Adding and Subtracting in Scientific Notation - Teacher Edition.docx
@@ -1686,6 +1686,42 @@
           <w:sz w:val="21"/>
         </w:rPr>
         <w:t>Q4 is today's lesson in miniature.</w:t>
+      </w:r>
+      <w:r>
+        <w:rPr>
+          <w:b w:val="0"/>
+          <w:i/>
+          <w:color w:val="6B6B6B"/>
+          <w:sz w:val="19"/>
+        </w:rPr>
+        <w:t xml:space="preserve">   1 retrieves 3.09 — small numbers in scientific notation: the 6 is in the ten-thousandths place (yesterday).</w:t>
+      </w:r>
+      <w:r>
+        <w:rPr>
+          <w:b w:val="0"/>
+          <w:i/>
+          <w:color w:val="6B6B6B"/>
+          <w:sz w:val="19"/>
+        </w:rPr>
+        <w:t xml:space="preserve">   2 retrieves 3.08 — divide the coefficients, divide the powers, multiply the results (last week).</w:t>
+      </w:r>
+      <w:r>
+        <w:rPr>
+          <w:b w:val="0"/>
+          <w:i/>
+          <w:color w:val="6B6B6B"/>
+          <w:sz w:val="19"/>
+        </w:rPr>
+        <w:t xml:space="preserve">   3 retrieves Unit 2 — perfect squares (2.01). Roots come back for good in 4.05 (last unit).</w:t>
+      </w:r>
+      <w:r>
+        <w:rPr>
+          <w:b w:val="0"/>
+          <w:i/>
+          <w:color w:val="6B6B6B"/>
+          <w:sz w:val="19"/>
+        </w:rPr>
+        <w:t xml:space="preserve">   4 retrieves MA.5.NSO.2.3 — adding decimals: line up the place values, not the digits (prior grade — the prerequisite this lesson needs).</w:t>
       </w:r>
     </w:p>
     <w:p>

</xml_diff>